<commit_message>
Fix notifications, greeting timezone, dropdown updates and reminder improvements
</commit_message>
<xml_diff>
--- a/templates/discounted_proposal_template.docx
+++ b/templates/discounted_proposal_template.docx
@@ -841,6 +841,7 @@
                                 <w:lang w:val="en-GB"/>
                               </w:rPr>
                             </w:pPr>
+                            <w:proofErr w:type="gramStart"/>
                             <w:r>
                               <w:rPr>
                                 <w:rFonts w:ascii="Arial Rounded MT Bold" w:hAnsi="Arial Rounded MT Bold" w:cstheme="minorHAnsi"/>
@@ -856,7 +857,25 @@
                                 <w:color w:val="FFFFFF" w:themeColor="background1"/>
                                 <w:lang w:val="en-GB"/>
                               </w:rPr>
-                              <w:t>reference_no</w:t>
+                              <w:t>reference</w:t>
+                            </w:r>
+                            <w:proofErr w:type="gramEnd"/>
+                            <w:r>
+                              <w:rPr>
+                                <w:rFonts w:ascii="Arial Rounded MT Bold" w:hAnsi="Arial Rounded MT Bold" w:cstheme="minorHAnsi"/>
+                                <w:color w:val="FFFFFF" w:themeColor="background1"/>
+                                <w:lang w:val="en-GB"/>
+                              </w:rPr>
+                              <w:t>_</w:t>
+                            </w:r>
+                            <w:proofErr w:type="gramStart"/>
+                            <w:r>
+                              <w:rPr>
+                                <w:rFonts w:ascii="Arial Rounded MT Bold" w:hAnsi="Arial Rounded MT Bold" w:cstheme="minorHAnsi"/>
+                                <w:color w:val="FFFFFF" w:themeColor="background1"/>
+                                <w:lang w:val="en-GB"/>
+                              </w:rPr>
+                              <w:t>no</w:t>
                             </w:r>
                             <w:proofErr w:type="spellEnd"/>
                             <w:r>
@@ -865,7 +884,16 @@
                                 <w:color w:val="FFFFFF" w:themeColor="background1"/>
                                 <w:lang w:val="en-GB"/>
                               </w:rPr>
-                              <w:t xml:space="preserve"> }}</w:t>
+                              <w:t xml:space="preserve"> }</w:t>
+                            </w:r>
+                            <w:proofErr w:type="gramEnd"/>
+                            <w:r>
+                              <w:rPr>
+                                <w:rFonts w:ascii="Arial Rounded MT Bold" w:hAnsi="Arial Rounded MT Bold" w:cstheme="minorHAnsi"/>
+                                <w:color w:val="FFFFFF" w:themeColor="background1"/>
+                                <w:lang w:val="en-GB"/>
+                              </w:rPr>
+                              <w:t>}</w:t>
                             </w:r>
                           </w:p>
                         </w:txbxContent>
@@ -1659,6 +1687,7 @@
                                 <w:lang w:val="en-GB"/>
                               </w:rPr>
                             </w:pPr>
+                            <w:proofErr w:type="gramStart"/>
                             <w:r>
                               <w:rPr>
                                 <w:rFonts w:ascii="Arial" w:hAnsi="Arial" w:cs="Arial"/>
@@ -1667,7 +1696,18 @@
                                 <w:szCs w:val="18"/>
                                 <w:lang w:val="en-GB"/>
                               </w:rPr>
-                              <w:t>{{ name }}</w:t>
+                              <w:t>{{ name</w:t>
+                            </w:r>
+                            <w:proofErr w:type="gramEnd"/>
+                            <w:r>
+                              <w:rPr>
+                                <w:rFonts w:ascii="Arial" w:hAnsi="Arial" w:cs="Arial"/>
+                                <w:color w:val="FFFFFF" w:themeColor="background1"/>
+                                <w:sz w:val="18"/>
+                                <w:szCs w:val="18"/>
+                                <w:lang w:val="en-GB"/>
+                              </w:rPr>
+                              <w:t xml:space="preserve"> }}</w:t>
                             </w:r>
                           </w:p>
                           <w:p>
@@ -1680,6 +1720,7 @@
                                 <w:lang w:val="en-GB"/>
                               </w:rPr>
                             </w:pPr>
+                            <w:proofErr w:type="gramStart"/>
                             <w:r>
                               <w:rPr>
                                 <w:rFonts w:ascii="Arial" w:hAnsi="Arial" w:cs="Arial"/>
@@ -1699,7 +1740,29 @@
                                 <w:szCs w:val="18"/>
                                 <w:lang w:val="en-GB"/>
                               </w:rPr>
-                              <w:t>site_address</w:t>
+                              <w:t>site</w:t>
+                            </w:r>
+                            <w:proofErr w:type="gramEnd"/>
+                            <w:r>
+                              <w:rPr>
+                                <w:rFonts w:ascii="Arial" w:hAnsi="Arial" w:cs="Arial"/>
+                                <w:color w:val="FFFFFF" w:themeColor="background1"/>
+                                <w:sz w:val="18"/>
+                                <w:szCs w:val="18"/>
+                                <w:lang w:val="en-GB"/>
+                              </w:rPr>
+                              <w:t>_</w:t>
+                            </w:r>
+                            <w:proofErr w:type="gramStart"/>
+                            <w:r>
+                              <w:rPr>
+                                <w:rFonts w:ascii="Arial" w:hAnsi="Arial" w:cs="Arial"/>
+                                <w:color w:val="FFFFFF" w:themeColor="background1"/>
+                                <w:sz w:val="18"/>
+                                <w:szCs w:val="18"/>
+                                <w:lang w:val="en-GB"/>
+                              </w:rPr>
+                              <w:t>address</w:t>
                             </w:r>
                             <w:proofErr w:type="spellEnd"/>
                             <w:r>
@@ -1710,7 +1773,18 @@
                                 <w:szCs w:val="18"/>
                                 <w:lang w:val="en-GB"/>
                               </w:rPr>
-                              <w:t xml:space="preserve"> }}</w:t>
+                              <w:t xml:space="preserve"> }</w:t>
+                            </w:r>
+                            <w:proofErr w:type="gramEnd"/>
+                            <w:r>
+                              <w:rPr>
+                                <w:rFonts w:ascii="Arial" w:hAnsi="Arial" w:cs="Arial"/>
+                                <w:color w:val="FFFFFF" w:themeColor="background1"/>
+                                <w:sz w:val="18"/>
+                                <w:szCs w:val="18"/>
+                                <w:lang w:val="en-GB"/>
+                              </w:rPr>
+                              <w:t>}</w:t>
                             </w:r>
                           </w:p>
                           <w:p>
@@ -1743,6 +1817,7 @@
                                 <w:sz w:val="18"/>
                               </w:rPr>
                             </w:pPr>
+                            <w:proofErr w:type="gramStart"/>
                             <w:r>
                               <w:rPr>
                                 <w:rFonts w:ascii="Arial" w:hAnsi="Arial" w:cs="Arial"/>
@@ -1758,7 +1833,25 @@
                                 <w:color w:val="FFFFFF" w:themeColor="background1"/>
                                 <w:sz w:val="18"/>
                               </w:rPr>
-                              <w:t>date_of_proposal_sent</w:t>
+                              <w:t>date</w:t>
+                            </w:r>
+                            <w:proofErr w:type="gramEnd"/>
+                            <w:r>
+                              <w:rPr>
+                                <w:rFonts w:ascii="Arial" w:hAnsi="Arial" w:cs="Arial"/>
+                                <w:color w:val="FFFFFF" w:themeColor="background1"/>
+                                <w:sz w:val="18"/>
+                              </w:rPr>
+                              <w:t>_of_proposal_</w:t>
+                            </w:r>
+                            <w:proofErr w:type="gramStart"/>
+                            <w:r>
+                              <w:rPr>
+                                <w:rFonts w:ascii="Arial" w:hAnsi="Arial" w:cs="Arial"/>
+                                <w:color w:val="FFFFFF" w:themeColor="background1"/>
+                                <w:sz w:val="18"/>
+                              </w:rPr>
+                              <w:t>sent</w:t>
                             </w:r>
                             <w:proofErr w:type="spellEnd"/>
                             <w:r>
@@ -1767,7 +1860,16 @@
                                 <w:color w:val="FFFFFF" w:themeColor="background1"/>
                                 <w:sz w:val="18"/>
                               </w:rPr>
-                              <w:t xml:space="preserve"> }}</w:t>
+                              <w:t xml:space="preserve"> }</w:t>
+                            </w:r>
+                            <w:proofErr w:type="gramEnd"/>
+                            <w:r>
+                              <w:rPr>
+                                <w:rFonts w:ascii="Arial" w:hAnsi="Arial" w:cs="Arial"/>
+                                <w:color w:val="FFFFFF" w:themeColor="background1"/>
+                                <w:sz w:val="18"/>
+                              </w:rPr>
+                              <w:t>}</w:t>
                             </w:r>
                           </w:p>
                         </w:txbxContent>
@@ -3240,11 +3342,24 @@
               <w:spacing w:before="0" w:line="232" w:lineRule="exact"/>
               <w:ind w:left="0"/>
             </w:pPr>
-            <w:r>
-              <w:t>{{ outdoor_pm25</w:t>
-            </w:r>
-            <w:r>
-              <w:t xml:space="preserve"> }} </w:t>
+            <w:proofErr w:type="gramStart"/>
+            <w:r>
+              <w:t>{{ outdoor</w:t>
+            </w:r>
+            <w:proofErr w:type="gramEnd"/>
+            <w:r>
+              <w:t>_pm</w:t>
+            </w:r>
+            <w:proofErr w:type="gramStart"/>
+            <w:r>
+              <w:t>25</w:t>
+            </w:r>
+            <w:r>
+              <w:t xml:space="preserve"> }</w:t>
+            </w:r>
+            <w:proofErr w:type="gramEnd"/>
+            <w:r>
+              <w:t xml:space="preserve">} </w:t>
             </w:r>
             <w:r>
               <w:rPr>
@@ -3366,8 +3481,21 @@
               <w:spacing w:before="0" w:line="234" w:lineRule="exact"/>
               <w:ind w:left="0"/>
             </w:pPr>
-            <w:r>
-              <w:t xml:space="preserve">{{ outdoor_pm10 }} </w:t>
+            <w:proofErr w:type="gramStart"/>
+            <w:r>
+              <w:t>{{ outdoor</w:t>
+            </w:r>
+            <w:proofErr w:type="gramEnd"/>
+            <w:r>
+              <w:t>_pm</w:t>
+            </w:r>
+            <w:proofErr w:type="gramStart"/>
+            <w:r>
+              <w:t>10 }</w:t>
+            </w:r>
+            <w:proofErr w:type="gramEnd"/>
+            <w:r>
+              <w:t xml:space="preserve">} </w:t>
             </w:r>
             <w:r>
               <w:rPr>
@@ -3478,8 +3606,21 @@
               <w:spacing w:before="0" w:line="232" w:lineRule="exact"/>
               <w:ind w:left="0"/>
             </w:pPr>
-            <w:r>
-              <w:t xml:space="preserve">{{ outdoor_co2 }} </w:t>
+            <w:proofErr w:type="gramStart"/>
+            <w:r>
+              <w:t>{{ outdoor</w:t>
+            </w:r>
+            <w:proofErr w:type="gramEnd"/>
+            <w:r>
+              <w:t>_co</w:t>
+            </w:r>
+            <w:proofErr w:type="gramStart"/>
+            <w:r>
+              <w:t>2 }</w:t>
+            </w:r>
+            <w:proofErr w:type="gramEnd"/>
+            <w:r>
+              <w:t xml:space="preserve">} </w:t>
             </w:r>
             <w:r>
               <w:rPr>
@@ -4430,6 +4571,7 @@
         </w:rPr>
         <w:t xml:space="preserve"> </w:t>
       </w:r>
+      <w:proofErr w:type="gramStart"/>
       <w:r>
         <w:rPr>
           <w:spacing w:val="-3"/>
@@ -4443,7 +4585,23 @@
           <w:spacing w:val="-3"/>
           <w:sz w:val="24"/>
         </w:rPr>
-        <w:t>total_area_sqft</w:t>
+        <w:t>total</w:t>
+      </w:r>
+      <w:proofErr w:type="gramEnd"/>
+      <w:r>
+        <w:rPr>
+          <w:spacing w:val="-3"/>
+          <w:sz w:val="24"/>
+        </w:rPr>
+        <w:t>_area_</w:t>
+      </w:r>
+      <w:proofErr w:type="gramStart"/>
+      <w:r>
+        <w:rPr>
+          <w:spacing w:val="-3"/>
+          <w:sz w:val="24"/>
+        </w:rPr>
+        <w:t>sqft</w:t>
       </w:r>
       <w:proofErr w:type="spellEnd"/>
       <w:r>
@@ -4451,7 +4609,15 @@
           <w:spacing w:val="-3"/>
           <w:sz w:val="24"/>
         </w:rPr>
-        <w:t xml:space="preserve"> }} </w:t>
+        <w:t xml:space="preserve"> }</w:t>
+      </w:r>
+      <w:proofErr w:type="gramEnd"/>
+      <w:r>
+        <w:rPr>
+          <w:spacing w:val="-3"/>
+          <w:sz w:val="24"/>
+        </w:rPr>
+        <w:t xml:space="preserve">} </w:t>
       </w:r>
       <w:r>
         <w:rPr>
@@ -4647,6 +4813,7 @@
         </w:rPr>
         <w:t>“</w:t>
       </w:r>
+      <w:proofErr w:type="gramStart"/>
       <w:r>
         <w:rPr>
           <w:b/>
@@ -4662,16 +4829,43 @@
           <w:color w:val="007AB8"/>
           <w:spacing w:val="-2"/>
         </w:rPr>
-        <w:t>no_of_mvd_units_in_words</w:t>
-      </w:r>
-      <w:proofErr w:type="spellEnd"/>
+        <w:t>no</w:t>
+      </w:r>
+      <w:proofErr w:type="gramEnd"/>
       <w:r>
         <w:rPr>
           <w:b/>
           <w:color w:val="007AB8"/>
           <w:spacing w:val="-2"/>
         </w:rPr>
-        <w:t xml:space="preserve"> }}</w:t>
+        <w:t>_of_mvd_units_in_</w:t>
+      </w:r>
+      <w:proofErr w:type="gramStart"/>
+      <w:r>
+        <w:rPr>
+          <w:b/>
+          <w:color w:val="007AB8"/>
+          <w:spacing w:val="-2"/>
+        </w:rPr>
+        <w:t>words</w:t>
+      </w:r>
+      <w:proofErr w:type="spellEnd"/>
+      <w:r>
+        <w:rPr>
+          <w:b/>
+          <w:color w:val="007AB8"/>
+          <w:spacing w:val="-2"/>
+        </w:rPr>
+        <w:t xml:space="preserve"> }</w:t>
+      </w:r>
+      <w:proofErr w:type="gramEnd"/>
+      <w:r>
+        <w:rPr>
+          <w:b/>
+          <w:color w:val="007AB8"/>
+          <w:spacing w:val="-2"/>
+        </w:rPr>
+        <w:t>}</w:t>
       </w:r>
       <w:r>
         <w:rPr>
@@ -4893,6 +5087,7 @@
                 <w:sz w:val="23"/>
               </w:rPr>
             </w:pPr>
+            <w:proofErr w:type="gramStart"/>
             <w:r>
               <w:rPr>
                 <w:spacing w:val="-10"/>
@@ -4906,7 +5101,15 @@
                 <w:spacing w:val="-10"/>
                 <w:sz w:val="23"/>
               </w:rPr>
-              <w:t>no_of_mvd_units</w:t>
+              <w:t>no</w:t>
+            </w:r>
+            <w:proofErr w:type="gramEnd"/>
+            <w:r>
+              <w:rPr>
+                <w:spacing w:val="-10"/>
+                <w:sz w:val="23"/>
+              </w:rPr>
+              <w:t>_of_mvd_units</w:t>
             </w:r>
             <w:proofErr w:type="spellEnd"/>
             <w:r>
@@ -4962,6 +5165,7 @@
                 <w:sz w:val="23"/>
               </w:rPr>
             </w:pPr>
+            <w:proofErr w:type="gramStart"/>
             <w:r>
               <w:rPr>
                 <w:b/>
@@ -4977,7 +5181,16 @@
                 <w:spacing w:val="-10"/>
                 <w:sz w:val="23"/>
               </w:rPr>
-              <w:t>total_no_of_units</w:t>
+              <w:t>total</w:t>
+            </w:r>
+            <w:proofErr w:type="gramEnd"/>
+            <w:r>
+              <w:rPr>
+                <w:b/>
+                <w:spacing w:val="-10"/>
+                <w:sz w:val="23"/>
+              </w:rPr>
+              <w:t>_no_of_units</w:t>
             </w:r>
             <w:proofErr w:type="spellEnd"/>
             <w:r>
@@ -5349,12 +5562,17 @@
                 <w:szCs w:val="20"/>
               </w:rPr>
             </w:pPr>
+            <w:proofErr w:type="gramStart"/>
             <w:r>
               <w:t xml:space="preserve">{{ </w:t>
             </w:r>
             <w:proofErr w:type="spellStart"/>
             <w:r>
-              <w:t>no_of_mvd_units</w:t>
+              <w:t>no</w:t>
+            </w:r>
+            <w:proofErr w:type="gramEnd"/>
+            <w:r>
+              <w:t>_of_mvd_units</w:t>
             </w:r>
             <w:proofErr w:type="spellEnd"/>
             <w:r>
@@ -5374,12 +5592,27 @@
                 <w:szCs w:val="20"/>
               </w:rPr>
             </w:pPr>
+            <w:proofErr w:type="gramStart"/>
             <w:r>
               <w:rPr>
                 <w:spacing w:val="-2"/>
                 <w:sz w:val="20"/>
               </w:rPr>
-              <w:t xml:space="preserve">{ </w:t>
+              <w:t>{</w:t>
+            </w:r>
+            <w:r>
+              <w:rPr>
+                <w:spacing w:val="-2"/>
+                <w:sz w:val="20"/>
+              </w:rPr>
+              <w:t>{</w:t>
+            </w:r>
+            <w:r>
+              <w:rPr>
+                <w:spacing w:val="-2"/>
+                <w:sz w:val="20"/>
+              </w:rPr>
+              <w:t xml:space="preserve"> </w:t>
             </w:r>
             <w:proofErr w:type="spellStart"/>
             <w:r>
@@ -5387,7 +5620,22 @@
                 <w:spacing w:val="-2"/>
                 <w:sz w:val="20"/>
               </w:rPr>
-              <w:t>cost_total_per_unit</w:t>
+              <w:t>per</w:t>
+            </w:r>
+            <w:proofErr w:type="gramEnd"/>
+            <w:r>
+              <w:rPr>
+                <w:spacing w:val="-2"/>
+                <w:sz w:val="20"/>
+              </w:rPr>
+              <w:t>_unit</w:t>
+            </w:r>
+            <w:r>
+              <w:rPr>
+                <w:spacing w:val="-2"/>
+                <w:sz w:val="20"/>
+              </w:rPr>
+              <w:t>_cost</w:t>
             </w:r>
             <w:proofErr w:type="spellEnd"/>
             <w:r>
@@ -5411,6 +5659,7 @@
                 <w:szCs w:val="20"/>
               </w:rPr>
             </w:pPr>
+            <w:proofErr w:type="gramStart"/>
             <w:r>
               <w:rPr>
                 <w:spacing w:val="-2"/>
@@ -5424,7 +5673,15 @@
                 <w:spacing w:val="-2"/>
                 <w:sz w:val="20"/>
               </w:rPr>
-              <w:t>total_mvd_cost</w:t>
+              <w:t>total</w:t>
+            </w:r>
+            <w:proofErr w:type="gramEnd"/>
+            <w:r>
+              <w:rPr>
+                <w:spacing w:val="-2"/>
+                <w:sz w:val="20"/>
+              </w:rPr>
+              <w:t>_mvd_cost</w:t>
             </w:r>
             <w:proofErr w:type="spellEnd"/>
             <w:r>
@@ -5547,6 +5804,7 @@
                 <w:szCs w:val="20"/>
               </w:rPr>
             </w:pPr>
+            <w:proofErr w:type="gramStart"/>
             <w:r>
               <w:rPr>
                 <w:spacing w:val="-10"/>
@@ -5560,7 +5818,15 @@
                 <w:spacing w:val="-10"/>
                 <w:sz w:val="20"/>
               </w:rPr>
-              <w:t>total_no_of_units</w:t>
+              <w:t>total</w:t>
+            </w:r>
+            <w:proofErr w:type="gramEnd"/>
+            <w:r>
+              <w:rPr>
+                <w:spacing w:val="-10"/>
+                <w:sz w:val="20"/>
+              </w:rPr>
+              <w:t>_no_of_units</w:t>
             </w:r>
             <w:proofErr w:type="spellEnd"/>
             <w:r>
@@ -5584,6 +5850,7 @@
                 <w:szCs w:val="20"/>
               </w:rPr>
             </w:pPr>
+            <w:proofErr w:type="gramStart"/>
             <w:r>
               <w:rPr>
                 <w:sz w:val="20"/>
@@ -5595,7 +5862,14 @@
               <w:rPr>
                 <w:sz w:val="20"/>
               </w:rPr>
-              <w:t>per_unit_cost</w:t>
+              <w:t>cmc</w:t>
+            </w:r>
+            <w:proofErr w:type="gramEnd"/>
+            <w:r>
+              <w:rPr>
+                <w:sz w:val="20"/>
+              </w:rPr>
+              <w:t>_cost</w:t>
             </w:r>
             <w:proofErr w:type="spellEnd"/>
             <w:r>
@@ -5618,6 +5892,7 @@
                 <w:szCs w:val="20"/>
               </w:rPr>
             </w:pPr>
+            <w:proofErr w:type="gramStart"/>
             <w:r>
               <w:rPr>
                 <w:sz w:val="20"/>
@@ -5625,6 +5900,19 @@
               <w:t xml:space="preserve">{{ </w:t>
             </w:r>
             <w:proofErr w:type="spellStart"/>
+            <w:r>
+              <w:rPr>
+                <w:sz w:val="20"/>
+              </w:rPr>
+              <w:t>total</w:t>
+            </w:r>
+            <w:proofErr w:type="gramEnd"/>
+            <w:r>
+              <w:rPr>
+                <w:sz w:val="20"/>
+              </w:rPr>
+              <w:t>_</w:t>
+            </w:r>
             <w:r>
               <w:rPr>
                 <w:sz w:val="20"/>
@@ -5750,6 +6038,7 @@
                 <w:szCs w:val="20"/>
               </w:rPr>
             </w:pPr>
+            <w:proofErr w:type="gramStart"/>
             <w:r>
               <w:rPr>
                 <w:spacing w:val="-10"/>
@@ -5763,7 +6052,15 @@
                 <w:spacing w:val="-10"/>
                 <w:sz w:val="20"/>
               </w:rPr>
-              <w:t>total_no_of_units</w:t>
+              <w:t>total</w:t>
+            </w:r>
+            <w:proofErr w:type="gramEnd"/>
+            <w:r>
+              <w:rPr>
+                <w:spacing w:val="-10"/>
+                <w:sz w:val="20"/>
+              </w:rPr>
+              <w:t>_no_of_units</w:t>
             </w:r>
             <w:proofErr w:type="spellEnd"/>
             <w:r>
@@ -5787,6 +6084,7 @@
                 <w:szCs w:val="20"/>
               </w:rPr>
             </w:pPr>
+            <w:proofErr w:type="gramStart"/>
             <w:r>
               <w:rPr>
                 <w:spacing w:val="-2"/>
@@ -5798,7 +6096,14 @@
               <w:rPr>
                 <w:spacing w:val="-2"/>
               </w:rPr>
-              <w:t>installation_cost</w:t>
+              <w:t>installation</w:t>
+            </w:r>
+            <w:proofErr w:type="gramEnd"/>
+            <w:r>
+              <w:rPr>
+                <w:spacing w:val="-2"/>
+              </w:rPr>
+              <w:t>_cost</w:t>
             </w:r>
             <w:proofErr w:type="spellEnd"/>
             <w:r>
@@ -5821,6 +6126,7 @@
                 <w:szCs w:val="20"/>
               </w:rPr>
             </w:pPr>
+            <w:proofErr w:type="gramStart"/>
             <w:r>
               <w:rPr>
                 <w:spacing w:val="-2"/>
@@ -5828,6 +6134,19 @@
               <w:t xml:space="preserve">{{ </w:t>
             </w:r>
             <w:proofErr w:type="spellStart"/>
+            <w:r>
+              <w:rPr>
+                <w:spacing w:val="-2"/>
+              </w:rPr>
+              <w:t>total</w:t>
+            </w:r>
+            <w:proofErr w:type="gramEnd"/>
+            <w:r>
+              <w:rPr>
+                <w:spacing w:val="-2"/>
+              </w:rPr>
+              <w:t>_</w:t>
+            </w:r>
             <w:r>
               <w:rPr>
                 <w:spacing w:val="-2"/>
@@ -5903,6 +6222,7 @@
                 <w:szCs w:val="20"/>
               </w:rPr>
             </w:pPr>
+            <w:proofErr w:type="gramStart"/>
             <w:r>
               <w:rPr>
                 <w:bCs/>
@@ -5918,7 +6238,16 @@
                 <w:sz w:val="20"/>
                 <w:szCs w:val="20"/>
               </w:rPr>
-              <w:t>total_</w:t>
+              <w:t>total</w:t>
+            </w:r>
+            <w:proofErr w:type="gramEnd"/>
+            <w:r>
+              <w:rPr>
+                <w:bCs/>
+                <w:sz w:val="20"/>
+                <w:szCs w:val="20"/>
+              </w:rPr>
+              <w:t>_</w:t>
             </w:r>
             <w:r>
               <w:rPr>
@@ -5952,6 +6281,7 @@
                 <w:szCs w:val="20"/>
               </w:rPr>
             </w:pPr>
+            <w:proofErr w:type="gramStart"/>
             <w:r>
               <w:rPr>
                 <w:bCs/>
@@ -5967,7 +6297,16 @@
                 <w:sz w:val="20"/>
                 <w:szCs w:val="20"/>
               </w:rPr>
-              <w:t>total_amount</w:t>
+              <w:t>total</w:t>
+            </w:r>
+            <w:proofErr w:type="gramEnd"/>
+            <w:r>
+              <w:rPr>
+                <w:bCs/>
+                <w:sz w:val="20"/>
+                <w:szCs w:val="20"/>
+              </w:rPr>
+              <w:t>_amount</w:t>
             </w:r>
             <w:proofErr w:type="spellEnd"/>
             <w:r>
@@ -6082,6 +6421,7 @@
                 <w:szCs w:val="20"/>
               </w:rPr>
             </w:pPr>
+            <w:proofErr w:type="gramStart"/>
             <w:r>
               <w:rPr>
                 <w:b/>
@@ -6089,7 +6429,17 @@
                 <w:sz w:val="20"/>
                 <w:szCs w:val="20"/>
               </w:rPr>
-              <w:t>{{ discount }}</w:t>
+              <w:t>{{ discount</w:t>
+            </w:r>
+            <w:proofErr w:type="gramEnd"/>
+            <w:r>
+              <w:rPr>
+                <w:b/>
+                <w:color w:val="943634" w:themeColor="accent2" w:themeShade="BF"/>
+                <w:sz w:val="20"/>
+                <w:szCs w:val="20"/>
+              </w:rPr>
+              <w:t xml:space="preserve"> }}</w:t>
             </w:r>
           </w:p>
         </w:tc>
@@ -6163,6 +6513,7 @@
                 <w:szCs w:val="20"/>
               </w:rPr>
             </w:pPr>
+            <w:proofErr w:type="gramStart"/>
             <w:r>
               <w:rPr>
                 <w:b/>
@@ -6178,7 +6529,16 @@
                 <w:sz w:val="20"/>
                 <w:szCs w:val="20"/>
               </w:rPr>
-              <w:t>final_amount_in_words</w:t>
+              <w:t>final</w:t>
+            </w:r>
+            <w:proofErr w:type="gramEnd"/>
+            <w:r>
+              <w:rPr>
+                <w:b/>
+                <w:sz w:val="20"/>
+                <w:szCs w:val="20"/>
+              </w:rPr>
+              <w:t>_amount_in_words</w:t>
             </w:r>
             <w:proofErr w:type="spellEnd"/>
             <w:r>
@@ -6204,6 +6564,7 @@
                 <w:szCs w:val="20"/>
               </w:rPr>
             </w:pPr>
+            <w:proofErr w:type="gramStart"/>
             <w:r>
               <w:rPr>
                 <w:b/>
@@ -6219,7 +6580,16 @@
                 <w:sz w:val="20"/>
                 <w:szCs w:val="20"/>
               </w:rPr>
-              <w:t>final_amount</w:t>
+              <w:t>final</w:t>
+            </w:r>
+            <w:proofErr w:type="gramEnd"/>
+            <w:r>
+              <w:rPr>
+                <w:b/>
+                <w:sz w:val="20"/>
+                <w:szCs w:val="20"/>
+              </w:rPr>
+              <w:t>_amount</w:t>
             </w:r>
             <w:proofErr w:type="spellEnd"/>
             <w:r>
@@ -6530,6 +6900,7 @@
         </w:rPr>
         <w:t xml:space="preserve"> </w:t>
       </w:r>
+      <w:proofErr w:type="gramStart"/>
       <w:r>
         <w:rPr>
           <w:sz w:val="24"/>
@@ -6541,14 +6912,35 @@
         <w:rPr>
           <w:sz w:val="24"/>
         </w:rPr>
-        <w:t>per_unit_cost</w:t>
+        <w:t>cmc</w:t>
+      </w:r>
+      <w:proofErr w:type="gramEnd"/>
+      <w:r>
+        <w:rPr>
+          <w:sz w:val="24"/>
+        </w:rPr>
+        <w:t>_</w:t>
+      </w:r>
+      <w:proofErr w:type="gramStart"/>
+      <w:r>
+        <w:rPr>
+          <w:sz w:val="24"/>
+        </w:rPr>
+        <w:t>cost</w:t>
       </w:r>
       <w:proofErr w:type="spellEnd"/>
       <w:r>
         <w:rPr>
           <w:sz w:val="24"/>
         </w:rPr>
-        <w:t xml:space="preserve"> }}</w:t>
+        <w:t xml:space="preserve"> }</w:t>
+      </w:r>
+      <w:proofErr w:type="gramEnd"/>
+      <w:r>
+        <w:rPr>
+          <w:sz w:val="24"/>
+        </w:rPr>
+        <w:t>}</w:t>
       </w:r>
       <w:r>
         <w:rPr>

</xml_diff>

<commit_message>
Enhance CRM with reminders, greetings, proposal generation updates, filter analytics, file upload fixes, service due tracking, and UI improvements
</commit_message>
<xml_diff>
--- a/templates/discounted_proposal_template.docx
+++ b/templates/discounted_proposal_template.docx
@@ -584,7 +584,6 @@
           <w:rFonts w:ascii="Arial MT"/>
         </w:rPr>
       </w:pPr>
-      <w:proofErr w:type="spellStart"/>
       <w:r>
         <w:rPr>
           <w:rFonts w:ascii="Arial MT"/>
@@ -592,7 +591,6 @@
         </w:rPr>
         <w:t>ers</w:t>
       </w:r>
-      <w:proofErr w:type="spellEnd"/>
     </w:p>
     <w:p>
       <w:pPr>
@@ -841,59 +839,13 @@
                                 <w:lang w:val="en-GB"/>
                               </w:rPr>
                             </w:pPr>
-                            <w:proofErr w:type="gramStart"/>
                             <w:r>
                               <w:rPr>
                                 <w:rFonts w:ascii="Arial Rounded MT Bold" w:hAnsi="Arial Rounded MT Bold" w:cstheme="minorHAnsi"/>
                                 <w:color w:val="FFFFFF" w:themeColor="background1"/>
                                 <w:lang w:val="en-GB"/>
                               </w:rPr>
-                              <w:t xml:space="preserve">{{ </w:t>
-                            </w:r>
-                            <w:proofErr w:type="spellStart"/>
-                            <w:r>
-                              <w:rPr>
-                                <w:rFonts w:ascii="Arial Rounded MT Bold" w:hAnsi="Arial Rounded MT Bold" w:cstheme="minorHAnsi"/>
-                                <w:color w:val="FFFFFF" w:themeColor="background1"/>
-                                <w:lang w:val="en-GB"/>
-                              </w:rPr>
-                              <w:t>reference</w:t>
-                            </w:r>
-                            <w:proofErr w:type="gramEnd"/>
-                            <w:r>
-                              <w:rPr>
-                                <w:rFonts w:ascii="Arial Rounded MT Bold" w:hAnsi="Arial Rounded MT Bold" w:cstheme="minorHAnsi"/>
-                                <w:color w:val="FFFFFF" w:themeColor="background1"/>
-                                <w:lang w:val="en-GB"/>
-                              </w:rPr>
-                              <w:t>_</w:t>
-                            </w:r>
-                            <w:proofErr w:type="gramStart"/>
-                            <w:r>
-                              <w:rPr>
-                                <w:rFonts w:ascii="Arial Rounded MT Bold" w:hAnsi="Arial Rounded MT Bold" w:cstheme="minorHAnsi"/>
-                                <w:color w:val="FFFFFF" w:themeColor="background1"/>
-                                <w:lang w:val="en-GB"/>
-                              </w:rPr>
-                              <w:t>no</w:t>
-                            </w:r>
-                            <w:proofErr w:type="spellEnd"/>
-                            <w:r>
-                              <w:rPr>
-                                <w:rFonts w:ascii="Arial Rounded MT Bold" w:hAnsi="Arial Rounded MT Bold" w:cstheme="minorHAnsi"/>
-                                <w:color w:val="FFFFFF" w:themeColor="background1"/>
-                                <w:lang w:val="en-GB"/>
-                              </w:rPr>
-                              <w:t xml:space="preserve"> }</w:t>
-                            </w:r>
-                            <w:proofErr w:type="gramEnd"/>
-                            <w:r>
-                              <w:rPr>
-                                <w:rFonts w:ascii="Arial Rounded MT Bold" w:hAnsi="Arial Rounded MT Bold" w:cstheme="minorHAnsi"/>
-                                <w:color w:val="FFFFFF" w:themeColor="background1"/>
-                                <w:lang w:val="en-GB"/>
-                              </w:rPr>
-                              <w:t>}</w:t>
+                              <w:t>{{ reference_no }}</w:t>
                             </w:r>
                           </w:p>
                         </w:txbxContent>
@@ -1687,7 +1639,6 @@
                                 <w:lang w:val="en-GB"/>
                               </w:rPr>
                             </w:pPr>
-                            <w:proofErr w:type="gramStart"/>
                             <w:r>
                               <w:rPr>
                                 <w:rFonts w:ascii="Arial" w:hAnsi="Arial" w:cs="Arial"/>
@@ -1696,18 +1647,7 @@
                                 <w:szCs w:val="18"/>
                                 <w:lang w:val="en-GB"/>
                               </w:rPr>
-                              <w:t>{{ name</w:t>
-                            </w:r>
-                            <w:proofErr w:type="gramEnd"/>
-                            <w:r>
-                              <w:rPr>
-                                <w:rFonts w:ascii="Arial" w:hAnsi="Arial" w:cs="Arial"/>
-                                <w:color w:val="FFFFFF" w:themeColor="background1"/>
-                                <w:sz w:val="18"/>
-                                <w:szCs w:val="18"/>
-                                <w:lang w:val="en-GB"/>
-                              </w:rPr>
-                              <w:t xml:space="preserve"> }}</w:t>
+                              <w:t>{{ name }}</w:t>
                             </w:r>
                           </w:p>
                           <w:p>
@@ -1720,7 +1660,6 @@
                                 <w:lang w:val="en-GB"/>
                               </w:rPr>
                             </w:pPr>
-                            <w:proofErr w:type="gramStart"/>
                             <w:r>
                               <w:rPr>
                                 <w:rFonts w:ascii="Arial" w:hAnsi="Arial" w:cs="Arial"/>
@@ -1729,62 +1668,7 @@
                                 <w:szCs w:val="18"/>
                                 <w:lang w:val="en-GB"/>
                               </w:rPr>
-                              <w:t xml:space="preserve">{{ </w:t>
-                            </w:r>
-                            <w:proofErr w:type="spellStart"/>
-                            <w:r>
-                              <w:rPr>
-                                <w:rFonts w:ascii="Arial" w:hAnsi="Arial" w:cs="Arial"/>
-                                <w:color w:val="FFFFFF" w:themeColor="background1"/>
-                                <w:sz w:val="18"/>
-                                <w:szCs w:val="18"/>
-                                <w:lang w:val="en-GB"/>
-                              </w:rPr>
-                              <w:t>site</w:t>
-                            </w:r>
-                            <w:proofErr w:type="gramEnd"/>
-                            <w:r>
-                              <w:rPr>
-                                <w:rFonts w:ascii="Arial" w:hAnsi="Arial" w:cs="Arial"/>
-                                <w:color w:val="FFFFFF" w:themeColor="background1"/>
-                                <w:sz w:val="18"/>
-                                <w:szCs w:val="18"/>
-                                <w:lang w:val="en-GB"/>
-                              </w:rPr>
-                              <w:t>_</w:t>
-                            </w:r>
-                            <w:proofErr w:type="gramStart"/>
-                            <w:r>
-                              <w:rPr>
-                                <w:rFonts w:ascii="Arial" w:hAnsi="Arial" w:cs="Arial"/>
-                                <w:color w:val="FFFFFF" w:themeColor="background1"/>
-                                <w:sz w:val="18"/>
-                                <w:szCs w:val="18"/>
-                                <w:lang w:val="en-GB"/>
-                              </w:rPr>
-                              <w:t>address</w:t>
-                            </w:r>
-                            <w:proofErr w:type="spellEnd"/>
-                            <w:r>
-                              <w:rPr>
-                                <w:rFonts w:ascii="Arial" w:hAnsi="Arial" w:cs="Arial"/>
-                                <w:color w:val="FFFFFF" w:themeColor="background1"/>
-                                <w:sz w:val="18"/>
-                                <w:szCs w:val="18"/>
-                                <w:lang w:val="en-GB"/>
-                              </w:rPr>
-                              <w:t xml:space="preserve"> }</w:t>
-                            </w:r>
-                            <w:proofErr w:type="gramEnd"/>
-                            <w:r>
-                              <w:rPr>
-                                <w:rFonts w:ascii="Arial" w:hAnsi="Arial" w:cs="Arial"/>
-                                <w:color w:val="FFFFFF" w:themeColor="background1"/>
-                                <w:sz w:val="18"/>
-                                <w:szCs w:val="18"/>
-                                <w:lang w:val="en-GB"/>
-                              </w:rPr>
-                              <w:t>}</w:t>
+                              <w:t>{{ site_address }}</w:t>
                             </w:r>
                           </w:p>
                           <w:p>
@@ -1817,59 +1701,13 @@
                                 <w:sz w:val="18"/>
                               </w:rPr>
                             </w:pPr>
-                            <w:proofErr w:type="gramStart"/>
                             <w:r>
                               <w:rPr>
                                 <w:rFonts w:ascii="Arial" w:hAnsi="Arial" w:cs="Arial"/>
                                 <w:color w:val="FFFFFF" w:themeColor="background1"/>
                                 <w:sz w:val="18"/>
                               </w:rPr>
-                              <w:t xml:space="preserve">{{ </w:t>
-                            </w:r>
-                            <w:proofErr w:type="spellStart"/>
-                            <w:r>
-                              <w:rPr>
-                                <w:rFonts w:ascii="Arial" w:hAnsi="Arial" w:cs="Arial"/>
-                                <w:color w:val="FFFFFF" w:themeColor="background1"/>
-                                <w:sz w:val="18"/>
-                              </w:rPr>
-                              <w:t>date</w:t>
-                            </w:r>
-                            <w:proofErr w:type="gramEnd"/>
-                            <w:r>
-                              <w:rPr>
-                                <w:rFonts w:ascii="Arial" w:hAnsi="Arial" w:cs="Arial"/>
-                                <w:color w:val="FFFFFF" w:themeColor="background1"/>
-                                <w:sz w:val="18"/>
-                              </w:rPr>
-                              <w:t>_of_proposal_</w:t>
-                            </w:r>
-                            <w:proofErr w:type="gramStart"/>
-                            <w:r>
-                              <w:rPr>
-                                <w:rFonts w:ascii="Arial" w:hAnsi="Arial" w:cs="Arial"/>
-                                <w:color w:val="FFFFFF" w:themeColor="background1"/>
-                                <w:sz w:val="18"/>
-                              </w:rPr>
-                              <w:t>sent</w:t>
-                            </w:r>
-                            <w:proofErr w:type="spellEnd"/>
-                            <w:r>
-                              <w:rPr>
-                                <w:rFonts w:ascii="Arial" w:hAnsi="Arial" w:cs="Arial"/>
-                                <w:color w:val="FFFFFF" w:themeColor="background1"/>
-                                <w:sz w:val="18"/>
-                              </w:rPr>
-                              <w:t xml:space="preserve"> }</w:t>
-                            </w:r>
-                            <w:proofErr w:type="gramEnd"/>
-                            <w:r>
-                              <w:rPr>
-                                <w:rFonts w:ascii="Arial" w:hAnsi="Arial" w:cs="Arial"/>
-                                <w:color w:val="FFFFFF" w:themeColor="background1"/>
-                                <w:sz w:val="18"/>
-                              </w:rPr>
-                              <w:t>}</w:t>
+                              <w:t>{{ date_of_proposal_sent }}</w:t>
                             </w:r>
                           </w:p>
                         </w:txbxContent>
@@ -2494,14 +2332,12 @@
         </w:rPr>
         <w:t xml:space="preserve"> </w:t>
       </w:r>
-      <w:proofErr w:type="spellStart"/>
       <w:r>
         <w:rPr>
           <w:color w:val="336699"/>
         </w:rPr>
         <w:t>MeVaChi</w:t>
       </w:r>
-      <w:proofErr w:type="spellEnd"/>
       <w:r>
         <w:rPr>
           <w:color w:val="336699"/>
@@ -3342,24 +3178,11 @@
               <w:spacing w:before="0" w:line="232" w:lineRule="exact"/>
               <w:ind w:left="0"/>
             </w:pPr>
-            <w:proofErr w:type="gramStart"/>
-            <w:r>
-              <w:t>{{ outdoor</w:t>
-            </w:r>
-            <w:proofErr w:type="gramEnd"/>
-            <w:r>
-              <w:t>_pm</w:t>
-            </w:r>
-            <w:proofErr w:type="gramStart"/>
-            <w:r>
-              <w:t>25</w:t>
-            </w:r>
-            <w:r>
-              <w:t xml:space="preserve"> }</w:t>
-            </w:r>
-            <w:proofErr w:type="gramEnd"/>
-            <w:r>
-              <w:t xml:space="preserve">} </w:t>
+            <w:r>
+              <w:t>{{ outdoor_pm25</w:t>
+            </w:r>
+            <w:r>
+              <w:t xml:space="preserve"> }} </w:t>
             </w:r>
             <w:r>
               <w:rPr>
@@ -3481,21 +3304,8 @@
               <w:spacing w:before="0" w:line="234" w:lineRule="exact"/>
               <w:ind w:left="0"/>
             </w:pPr>
-            <w:proofErr w:type="gramStart"/>
-            <w:r>
-              <w:t>{{ outdoor</w:t>
-            </w:r>
-            <w:proofErr w:type="gramEnd"/>
-            <w:r>
-              <w:t>_pm</w:t>
-            </w:r>
-            <w:proofErr w:type="gramStart"/>
-            <w:r>
-              <w:t>10 }</w:t>
-            </w:r>
-            <w:proofErr w:type="gramEnd"/>
-            <w:r>
-              <w:t xml:space="preserve">} </w:t>
+            <w:r>
+              <w:t xml:space="preserve">{{ outdoor_pm10 }} </w:t>
             </w:r>
             <w:r>
               <w:rPr>
@@ -3606,21 +3416,8 @@
               <w:spacing w:before="0" w:line="232" w:lineRule="exact"/>
               <w:ind w:left="0"/>
             </w:pPr>
-            <w:proofErr w:type="gramStart"/>
-            <w:r>
-              <w:t>{{ outdoor</w:t>
-            </w:r>
-            <w:proofErr w:type="gramEnd"/>
-            <w:r>
-              <w:t>_co</w:t>
-            </w:r>
-            <w:proofErr w:type="gramStart"/>
-            <w:r>
-              <w:t>2 }</w:t>
-            </w:r>
-            <w:proofErr w:type="gramEnd"/>
-            <w:r>
-              <w:t xml:space="preserve">} </w:t>
+            <w:r>
+              <w:t xml:space="preserve">{{ outdoor_co2 }} </w:t>
             </w:r>
             <w:r>
               <w:rPr>
@@ -4571,53 +4368,12 @@
         </w:rPr>
         <w:t xml:space="preserve"> </w:t>
       </w:r>
-      <w:proofErr w:type="gramStart"/>
       <w:r>
         <w:rPr>
           <w:spacing w:val="-3"/>
           <w:sz w:val="24"/>
         </w:rPr>
-        <w:t xml:space="preserve">{{ </w:t>
-      </w:r>
-      <w:proofErr w:type="spellStart"/>
-      <w:r>
-        <w:rPr>
-          <w:spacing w:val="-3"/>
-          <w:sz w:val="24"/>
-        </w:rPr>
-        <w:t>total</w:t>
-      </w:r>
-      <w:proofErr w:type="gramEnd"/>
-      <w:r>
-        <w:rPr>
-          <w:spacing w:val="-3"/>
-          <w:sz w:val="24"/>
-        </w:rPr>
-        <w:t>_area_</w:t>
-      </w:r>
-      <w:proofErr w:type="gramStart"/>
-      <w:r>
-        <w:rPr>
-          <w:spacing w:val="-3"/>
-          <w:sz w:val="24"/>
-        </w:rPr>
-        <w:t>sqft</w:t>
-      </w:r>
-      <w:proofErr w:type="spellEnd"/>
-      <w:r>
-        <w:rPr>
-          <w:spacing w:val="-3"/>
-          <w:sz w:val="24"/>
-        </w:rPr>
-        <w:t xml:space="preserve"> }</w:t>
-      </w:r>
-      <w:proofErr w:type="gramEnd"/>
-      <w:r>
-        <w:rPr>
-          <w:spacing w:val="-3"/>
-          <w:sz w:val="24"/>
-        </w:rPr>
-        <w:t xml:space="preserve">} </w:t>
+        <w:t xml:space="preserve">{{ total_area_sqft }} </w:t>
       </w:r>
       <w:r>
         <w:rPr>
@@ -4813,59 +4569,13 @@
         </w:rPr>
         <w:t>“</w:t>
       </w:r>
-      <w:proofErr w:type="gramStart"/>
       <w:r>
         <w:rPr>
           <w:b/>
           <w:color w:val="007AB8"/>
           <w:spacing w:val="-2"/>
         </w:rPr>
-        <w:t xml:space="preserve">{{ </w:t>
-      </w:r>
-      <w:proofErr w:type="spellStart"/>
-      <w:r>
-        <w:rPr>
-          <w:b/>
-          <w:color w:val="007AB8"/>
-          <w:spacing w:val="-2"/>
-        </w:rPr>
-        <w:t>no</w:t>
-      </w:r>
-      <w:proofErr w:type="gramEnd"/>
-      <w:r>
-        <w:rPr>
-          <w:b/>
-          <w:color w:val="007AB8"/>
-          <w:spacing w:val="-2"/>
-        </w:rPr>
-        <w:t>_of_mvd_units_in_</w:t>
-      </w:r>
-      <w:proofErr w:type="gramStart"/>
-      <w:r>
-        <w:rPr>
-          <w:b/>
-          <w:color w:val="007AB8"/>
-          <w:spacing w:val="-2"/>
-        </w:rPr>
-        <w:t>words</w:t>
-      </w:r>
-      <w:proofErr w:type="spellEnd"/>
-      <w:r>
-        <w:rPr>
-          <w:b/>
-          <w:color w:val="007AB8"/>
-          <w:spacing w:val="-2"/>
-        </w:rPr>
-        <w:t xml:space="preserve"> }</w:t>
-      </w:r>
-      <w:proofErr w:type="gramEnd"/>
-      <w:r>
-        <w:rPr>
-          <w:b/>
-          <w:color w:val="007AB8"/>
-          <w:spacing w:val="-2"/>
-        </w:rPr>
-        <w:t>}</w:t>
+        <w:t>{{ no_of_mvd_units_in_words }}</w:t>
       </w:r>
       <w:r>
         <w:rPr>
@@ -5087,37 +4797,12 @@
                 <w:sz w:val="23"/>
               </w:rPr>
             </w:pPr>
-            <w:proofErr w:type="gramStart"/>
             <w:r>
               <w:rPr>
                 <w:spacing w:val="-10"/>
                 <w:sz w:val="23"/>
               </w:rPr>
-              <w:t xml:space="preserve">{{ </w:t>
-            </w:r>
-            <w:proofErr w:type="spellStart"/>
-            <w:r>
-              <w:rPr>
-                <w:spacing w:val="-10"/>
-                <w:sz w:val="23"/>
-              </w:rPr>
-              <w:t>no</w:t>
-            </w:r>
-            <w:proofErr w:type="gramEnd"/>
-            <w:r>
-              <w:rPr>
-                <w:spacing w:val="-10"/>
-                <w:sz w:val="23"/>
-              </w:rPr>
-              <w:t>_of_mvd_units</w:t>
-            </w:r>
-            <w:proofErr w:type="spellEnd"/>
-            <w:r>
-              <w:rPr>
-                <w:spacing w:val="-10"/>
-                <w:sz w:val="23"/>
-              </w:rPr>
-              <w:t xml:space="preserve"> }}</w:t>
+              <w:t>{{ no_of_mvd_units }}</w:t>
             </w:r>
           </w:p>
         </w:tc>
@@ -5165,41 +4850,13 @@
                 <w:sz w:val="23"/>
               </w:rPr>
             </w:pPr>
-            <w:proofErr w:type="gramStart"/>
             <w:r>
               <w:rPr>
                 <w:b/>
                 <w:spacing w:val="-10"/>
                 <w:sz w:val="23"/>
               </w:rPr>
-              <w:t xml:space="preserve">{{ </w:t>
-            </w:r>
-            <w:proofErr w:type="spellStart"/>
-            <w:r>
-              <w:rPr>
-                <w:b/>
-                <w:spacing w:val="-10"/>
-                <w:sz w:val="23"/>
-              </w:rPr>
-              <w:t>total</w:t>
-            </w:r>
-            <w:proofErr w:type="gramEnd"/>
-            <w:r>
-              <w:rPr>
-                <w:b/>
-                <w:spacing w:val="-10"/>
-                <w:sz w:val="23"/>
-              </w:rPr>
-              <w:t>_no_of_units</w:t>
-            </w:r>
-            <w:proofErr w:type="spellEnd"/>
-            <w:r>
-              <w:rPr>
-                <w:b/>
-                <w:spacing w:val="-10"/>
-                <w:sz w:val="23"/>
-              </w:rPr>
-              <w:t xml:space="preserve"> }}</w:t>
+              <w:t>{{ total_no_of_units }}</w:t>
             </w:r>
           </w:p>
         </w:tc>
@@ -5562,21 +5219,8 @@
                 <w:szCs w:val="20"/>
               </w:rPr>
             </w:pPr>
-            <w:proofErr w:type="gramStart"/>
-            <w:r>
-              <w:t xml:space="preserve">{{ </w:t>
-            </w:r>
-            <w:proofErr w:type="spellStart"/>
-            <w:r>
-              <w:t>no</w:t>
-            </w:r>
-            <w:proofErr w:type="gramEnd"/>
-            <w:r>
-              <w:t>_of_mvd_units</w:t>
-            </w:r>
-            <w:proofErr w:type="spellEnd"/>
-            <w:r>
-              <w:t xml:space="preserve"> }}</w:t>
+            <w:r>
+              <w:t>{{ no_of_mvd_units }}</w:t>
             </w:r>
           </w:p>
         </w:tc>
@@ -5592,7 +5236,6 @@
                 <w:szCs w:val="20"/>
               </w:rPr>
             </w:pPr>
-            <w:proofErr w:type="gramStart"/>
             <w:r>
               <w:rPr>
                 <w:spacing w:val="-2"/>
@@ -5612,32 +5255,15 @@
                 <w:spacing w:val="-2"/>
                 <w:sz w:val="20"/>
               </w:rPr>
-              <w:t xml:space="preserve"> </w:t>
-            </w:r>
-            <w:proofErr w:type="spellStart"/>
+              <w:t xml:space="preserve"> per_unit</w:t>
+            </w:r>
             <w:r>
               <w:rPr>
                 <w:spacing w:val="-2"/>
                 <w:sz w:val="20"/>
               </w:rPr>
-              <w:t>per</w:t>
-            </w:r>
-            <w:proofErr w:type="gramEnd"/>
-            <w:r>
-              <w:rPr>
-                <w:spacing w:val="-2"/>
-                <w:sz w:val="20"/>
-              </w:rPr>
-              <w:t>_unit</w:t>
-            </w:r>
-            <w:r>
-              <w:rPr>
-                <w:spacing w:val="-2"/>
-                <w:sz w:val="20"/>
-              </w:rPr>
               <w:t>_cost</w:t>
             </w:r>
-            <w:proofErr w:type="spellEnd"/>
             <w:r>
               <w:rPr>
                 <w:spacing w:val="-2"/>
@@ -5659,37 +5285,12 @@
                 <w:szCs w:val="20"/>
               </w:rPr>
             </w:pPr>
-            <w:proofErr w:type="gramStart"/>
             <w:r>
               <w:rPr>
                 <w:spacing w:val="-2"/>
                 <w:sz w:val="20"/>
               </w:rPr>
-              <w:t xml:space="preserve">{{ </w:t>
-            </w:r>
-            <w:proofErr w:type="spellStart"/>
-            <w:r>
-              <w:rPr>
-                <w:spacing w:val="-2"/>
-                <w:sz w:val="20"/>
-              </w:rPr>
-              <w:t>total</w:t>
-            </w:r>
-            <w:proofErr w:type="gramEnd"/>
-            <w:r>
-              <w:rPr>
-                <w:spacing w:val="-2"/>
-                <w:sz w:val="20"/>
-              </w:rPr>
-              <w:t>_mvd_cost</w:t>
-            </w:r>
-            <w:proofErr w:type="spellEnd"/>
-            <w:r>
-              <w:rPr>
-                <w:spacing w:val="-2"/>
-                <w:sz w:val="20"/>
-              </w:rPr>
-              <w:t xml:space="preserve"> }}</w:t>
+              <w:t>{{ total_mvd_cost }}</w:t>
             </w:r>
           </w:p>
         </w:tc>
@@ -5763,7 +5364,7 @@
                 <w:sz w:val="20"/>
                 <w:szCs w:val="20"/>
               </w:rPr>
-              <w:t>1</w:t>
+              <w:t>2</w:t>
             </w:r>
             <w:r>
               <w:rPr>
@@ -5772,7 +5373,7 @@
                 <w:szCs w:val="20"/>
                 <w:vertAlign w:val="superscript"/>
               </w:rPr>
-              <w:t>st</w:t>
+              <w:t>nd</w:t>
             </w:r>
             <w:r>
               <w:rPr>
@@ -5804,37 +5405,12 @@
                 <w:szCs w:val="20"/>
               </w:rPr>
             </w:pPr>
-            <w:proofErr w:type="gramStart"/>
             <w:r>
               <w:rPr>
                 <w:spacing w:val="-10"/>
                 <w:sz w:val="20"/>
               </w:rPr>
-              <w:t xml:space="preserve">{{ </w:t>
-            </w:r>
-            <w:proofErr w:type="spellStart"/>
-            <w:r>
-              <w:rPr>
-                <w:spacing w:val="-10"/>
-                <w:sz w:val="20"/>
-              </w:rPr>
-              <w:t>total</w:t>
-            </w:r>
-            <w:proofErr w:type="gramEnd"/>
-            <w:r>
-              <w:rPr>
-                <w:spacing w:val="-10"/>
-                <w:sz w:val="20"/>
-              </w:rPr>
-              <w:t>_no_of_units</w:t>
-            </w:r>
-            <w:proofErr w:type="spellEnd"/>
-            <w:r>
-              <w:rPr>
-                <w:spacing w:val="-10"/>
-                <w:sz w:val="20"/>
-              </w:rPr>
-              <w:t xml:space="preserve"> }}</w:t>
+              <w:t>{{ total_no_of_units }}</w:t>
             </w:r>
           </w:p>
         </w:tc>
@@ -5850,28 +5426,18 @@
                 <w:szCs w:val="20"/>
               </w:rPr>
             </w:pPr>
-            <w:proofErr w:type="gramStart"/>
             <w:r>
               <w:rPr>
                 <w:sz w:val="20"/>
               </w:rPr>
               <w:t xml:space="preserve">{{ </w:t>
             </w:r>
-            <w:proofErr w:type="spellStart"/>
             <w:r>
               <w:rPr>
                 <w:sz w:val="20"/>
               </w:rPr>
-              <w:t>cmc</w:t>
-            </w:r>
-            <w:proofErr w:type="gramEnd"/>
-            <w:r>
-              <w:rPr>
-                <w:sz w:val="20"/>
-              </w:rPr>
-              <w:t>_cost</w:t>
-            </w:r>
-            <w:proofErr w:type="spellEnd"/>
+              <w:t>cmc_cost</w:t>
+            </w:r>
             <w:r>
               <w:rPr>
                 <w:sz w:val="20"/>
@@ -5892,39 +5458,12 @@
                 <w:szCs w:val="20"/>
               </w:rPr>
             </w:pPr>
-            <w:proofErr w:type="gramStart"/>
             <w:r>
               <w:rPr>
                 <w:sz w:val="20"/>
-              </w:rPr>
-              <w:t xml:space="preserve">{{ </w:t>
-            </w:r>
-            <w:proofErr w:type="spellStart"/>
-            <w:r>
-              <w:rPr>
-                <w:sz w:val="20"/>
-              </w:rPr>
-              <w:t>total</w:t>
-            </w:r>
-            <w:proofErr w:type="gramEnd"/>
-            <w:r>
-              <w:rPr>
-                <w:sz w:val="20"/>
-              </w:rPr>
-              <w:t>_</w:t>
-            </w:r>
-            <w:r>
-              <w:rPr>
-                <w:sz w:val="20"/>
-              </w:rPr>
-              <w:t>cmc_cost</w:t>
-            </w:r>
-            <w:proofErr w:type="spellEnd"/>
-            <w:r>
-              <w:rPr>
-                <w:sz w:val="20"/>
-              </w:rPr>
-              <w:t xml:space="preserve"> }}</w:t>
+                <w:szCs w:val="20"/>
+              </w:rPr>
+              <w:t>-</w:t>
             </w:r>
           </w:p>
         </w:tc>
@@ -6038,37 +5577,12 @@
                 <w:szCs w:val="20"/>
               </w:rPr>
             </w:pPr>
-            <w:proofErr w:type="gramStart"/>
             <w:r>
               <w:rPr>
                 <w:spacing w:val="-10"/>
                 <w:sz w:val="20"/>
               </w:rPr>
-              <w:t xml:space="preserve">{{ </w:t>
-            </w:r>
-            <w:proofErr w:type="spellStart"/>
-            <w:r>
-              <w:rPr>
-                <w:spacing w:val="-10"/>
-                <w:sz w:val="20"/>
-              </w:rPr>
-              <w:t>total</w:t>
-            </w:r>
-            <w:proofErr w:type="gramEnd"/>
-            <w:r>
-              <w:rPr>
-                <w:spacing w:val="-10"/>
-                <w:sz w:val="20"/>
-              </w:rPr>
-              <w:t>_no_of_units</w:t>
-            </w:r>
-            <w:proofErr w:type="spellEnd"/>
-            <w:r>
-              <w:rPr>
-                <w:spacing w:val="-10"/>
-                <w:sz w:val="20"/>
-              </w:rPr>
-              <w:t xml:space="preserve"> }}</w:t>
+              <w:t>{{ total_no_of_units }}</w:t>
             </w:r>
           </w:p>
         </w:tc>
@@ -6084,33 +5598,11 @@
                 <w:szCs w:val="20"/>
               </w:rPr>
             </w:pPr>
-            <w:proofErr w:type="gramStart"/>
             <w:r>
               <w:rPr>
                 <w:spacing w:val="-2"/>
               </w:rPr>
-              <w:t xml:space="preserve">{{ </w:t>
-            </w:r>
-            <w:proofErr w:type="spellStart"/>
-            <w:r>
-              <w:rPr>
-                <w:spacing w:val="-2"/>
-              </w:rPr>
-              <w:t>installation</w:t>
-            </w:r>
-            <w:proofErr w:type="gramEnd"/>
-            <w:r>
-              <w:rPr>
-                <w:spacing w:val="-2"/>
-              </w:rPr>
-              <w:t>_cost</w:t>
-            </w:r>
-            <w:proofErr w:type="spellEnd"/>
-            <w:r>
-              <w:rPr>
-                <w:spacing w:val="-2"/>
-              </w:rPr>
-              <w:t xml:space="preserve"> }}</w:t>
+              <w:t>{{ installation_cost }}</w:t>
             </w:r>
           </w:p>
         </w:tc>
@@ -6126,39 +5618,23 @@
                 <w:szCs w:val="20"/>
               </w:rPr>
             </w:pPr>
-            <w:proofErr w:type="gramStart"/>
             <w:r>
               <w:rPr>
                 <w:spacing w:val="-2"/>
               </w:rPr>
               <w:t xml:space="preserve">{{ </w:t>
             </w:r>
-            <w:proofErr w:type="spellStart"/>
             <w:r>
               <w:rPr>
                 <w:spacing w:val="-2"/>
               </w:rPr>
-              <w:t>total</w:t>
-            </w:r>
-            <w:proofErr w:type="gramEnd"/>
+              <w:t>total_</w:t>
+            </w:r>
             <w:r>
               <w:rPr>
                 <w:spacing w:val="-2"/>
               </w:rPr>
-              <w:t>_</w:t>
-            </w:r>
-            <w:r>
-              <w:rPr>
-                <w:spacing w:val="-2"/>
-              </w:rPr>
-              <w:t>installation_cost</w:t>
-            </w:r>
-            <w:proofErr w:type="spellEnd"/>
-            <w:r>
-              <w:rPr>
-                <w:spacing w:val="-2"/>
-              </w:rPr>
-              <w:t xml:space="preserve"> }}</w:t>
+              <w:t>installation_cost }}</w:t>
             </w:r>
           </w:p>
         </w:tc>
@@ -6222,7 +5698,6 @@
                 <w:szCs w:val="20"/>
               </w:rPr>
             </w:pPr>
-            <w:proofErr w:type="gramStart"/>
             <w:r>
               <w:rPr>
                 <w:bCs/>
@@ -6231,40 +5706,21 @@
               </w:rPr>
               <w:t xml:space="preserve">{{ </w:t>
             </w:r>
-            <w:proofErr w:type="spellStart"/>
             <w:r>
               <w:rPr>
                 <w:bCs/>
                 <w:sz w:val="20"/>
                 <w:szCs w:val="20"/>
               </w:rPr>
-              <w:t>total</w:t>
-            </w:r>
-            <w:proofErr w:type="gramEnd"/>
+              <w:t>total_</w:t>
+            </w:r>
             <w:r>
               <w:rPr>
                 <w:bCs/>
                 <w:sz w:val="20"/>
                 <w:szCs w:val="20"/>
               </w:rPr>
-              <w:t>_</w:t>
-            </w:r>
-            <w:r>
-              <w:rPr>
-                <w:bCs/>
-                <w:sz w:val="20"/>
-                <w:szCs w:val="20"/>
-              </w:rPr>
-              <w:t>amount_in_words</w:t>
-            </w:r>
-            <w:proofErr w:type="spellEnd"/>
-            <w:r>
-              <w:rPr>
-                <w:bCs/>
-                <w:sz w:val="20"/>
-                <w:szCs w:val="20"/>
-              </w:rPr>
-              <w:t xml:space="preserve"> }}</w:t>
+              <w:t>amount_in_words }}</w:t>
             </w:r>
           </w:p>
         </w:tc>
@@ -6281,41 +5737,13 @@
                 <w:szCs w:val="20"/>
               </w:rPr>
             </w:pPr>
-            <w:proofErr w:type="gramStart"/>
             <w:r>
               <w:rPr>
                 <w:bCs/>
                 <w:sz w:val="20"/>
                 <w:szCs w:val="20"/>
               </w:rPr>
-              <w:t xml:space="preserve">{{ </w:t>
-            </w:r>
-            <w:proofErr w:type="spellStart"/>
-            <w:r>
-              <w:rPr>
-                <w:bCs/>
-                <w:sz w:val="20"/>
-                <w:szCs w:val="20"/>
-              </w:rPr>
-              <w:t>total</w:t>
-            </w:r>
-            <w:proofErr w:type="gramEnd"/>
-            <w:r>
-              <w:rPr>
-                <w:bCs/>
-                <w:sz w:val="20"/>
-                <w:szCs w:val="20"/>
-              </w:rPr>
-              <w:t>_amount</w:t>
-            </w:r>
-            <w:proofErr w:type="spellEnd"/>
-            <w:r>
-              <w:rPr>
-                <w:bCs/>
-                <w:sz w:val="20"/>
-                <w:szCs w:val="20"/>
-              </w:rPr>
-              <w:t xml:space="preserve"> }}</w:t>
+              <w:t>{{ total_amount }}</w:t>
             </w:r>
           </w:p>
         </w:tc>
@@ -6421,7 +5849,6 @@
                 <w:szCs w:val="20"/>
               </w:rPr>
             </w:pPr>
-            <w:proofErr w:type="gramStart"/>
             <w:r>
               <w:rPr>
                 <w:b/>
@@ -6429,17 +5856,7 @@
                 <w:sz w:val="20"/>
                 <w:szCs w:val="20"/>
               </w:rPr>
-              <w:t>{{ discount</w:t>
-            </w:r>
-            <w:proofErr w:type="gramEnd"/>
-            <w:r>
-              <w:rPr>
-                <w:b/>
-                <w:color w:val="943634" w:themeColor="accent2" w:themeShade="BF"/>
-                <w:sz w:val="20"/>
-                <w:szCs w:val="20"/>
-              </w:rPr>
-              <w:t xml:space="preserve"> }}</w:t>
+              <w:t>{{ discount }}</w:t>
             </w:r>
           </w:p>
         </w:tc>
@@ -6513,41 +5930,13 @@
                 <w:szCs w:val="20"/>
               </w:rPr>
             </w:pPr>
-            <w:proofErr w:type="gramStart"/>
             <w:r>
               <w:rPr>
                 <w:b/>
                 <w:sz w:val="20"/>
                 <w:szCs w:val="20"/>
               </w:rPr>
-              <w:t xml:space="preserve">{{ </w:t>
-            </w:r>
-            <w:proofErr w:type="spellStart"/>
-            <w:r>
-              <w:rPr>
-                <w:b/>
-                <w:sz w:val="20"/>
-                <w:szCs w:val="20"/>
-              </w:rPr>
-              <w:t>final</w:t>
-            </w:r>
-            <w:proofErr w:type="gramEnd"/>
-            <w:r>
-              <w:rPr>
-                <w:b/>
-                <w:sz w:val="20"/>
-                <w:szCs w:val="20"/>
-              </w:rPr>
-              <w:t>_amount_in_words</w:t>
-            </w:r>
-            <w:proofErr w:type="spellEnd"/>
-            <w:r>
-              <w:rPr>
-                <w:b/>
-                <w:sz w:val="20"/>
-                <w:szCs w:val="20"/>
-              </w:rPr>
-              <w:t xml:space="preserve"> }}</w:t>
+              <w:t>{{ final_amount_in_words }}</w:t>
             </w:r>
           </w:p>
         </w:tc>
@@ -6564,41 +5953,13 @@
                 <w:szCs w:val="20"/>
               </w:rPr>
             </w:pPr>
-            <w:proofErr w:type="gramStart"/>
             <w:r>
               <w:rPr>
                 <w:b/>
                 <w:sz w:val="20"/>
                 <w:szCs w:val="20"/>
               </w:rPr>
-              <w:t xml:space="preserve">{{ </w:t>
-            </w:r>
-            <w:proofErr w:type="spellStart"/>
-            <w:r>
-              <w:rPr>
-                <w:b/>
-                <w:sz w:val="20"/>
-                <w:szCs w:val="20"/>
-              </w:rPr>
-              <w:t>final</w:t>
-            </w:r>
-            <w:proofErr w:type="gramEnd"/>
-            <w:r>
-              <w:rPr>
-                <w:b/>
-                <w:sz w:val="20"/>
-                <w:szCs w:val="20"/>
-              </w:rPr>
-              <w:t>_amount</w:t>
-            </w:r>
-            <w:proofErr w:type="spellEnd"/>
-            <w:r>
-              <w:rPr>
-                <w:b/>
-                <w:sz w:val="20"/>
-                <w:szCs w:val="20"/>
-              </w:rPr>
-              <w:t xml:space="preserve"> }}</w:t>
+              <w:t>{{ final_amount }}</w:t>
             </w:r>
           </w:p>
         </w:tc>
@@ -6900,47 +6261,23 @@
         </w:rPr>
         <w:t xml:space="preserve"> </w:t>
       </w:r>
-      <w:proofErr w:type="gramStart"/>
       <w:r>
         <w:rPr>
           <w:sz w:val="24"/>
         </w:rPr>
         <w:t xml:space="preserve">{{ </w:t>
       </w:r>
-      <w:proofErr w:type="spellStart"/>
       <w:r>
         <w:rPr>
           <w:sz w:val="24"/>
         </w:rPr>
         <w:t>cmc</w:t>
       </w:r>
-      <w:proofErr w:type="gramEnd"/>
-      <w:r>
-        <w:rPr>
-          <w:sz w:val="24"/>
-        </w:rPr>
-        <w:t>_</w:t>
-      </w:r>
-      <w:proofErr w:type="gramStart"/>
-      <w:r>
-        <w:rPr>
-          <w:sz w:val="24"/>
-        </w:rPr>
-        <w:t>cost</w:t>
-      </w:r>
-      <w:proofErr w:type="spellEnd"/>
-      <w:r>
-        <w:rPr>
-          <w:sz w:val="24"/>
-        </w:rPr>
-        <w:t xml:space="preserve"> }</w:t>
-      </w:r>
-      <w:proofErr w:type="gramEnd"/>
-      <w:r>
-        <w:rPr>
-          <w:sz w:val="24"/>
-        </w:rPr>
-        <w:t>}</w:t>
+      <w:r>
+        <w:rPr>
+          <w:sz w:val="24"/>
+        </w:rPr>
+        <w:t>_cost }}</w:t>
       </w:r>
       <w:r>
         <w:rPr>

</xml_diff>